<commit_message>
foi finalisado o desenvolvimento do relatorio tecnico
</commit_message>
<xml_diff>
--- a/Relatório Técnico/Relatório Técnico Trabalho Banco de Dados.docx
+++ b/Relatório Técnico/Relatório Técnico Trabalho Banco de Dados.docx
@@ -421,7 +421,7 @@
           <w:r>
             <w:fldChar w:fldCharType="separate"/>
           </w:r>
-          <w:hyperlink w:anchor="_Toc230244797" w:history="1">
+          <w:hyperlink w:anchor="_Toc230270300" w:history="1">
             <w:r>
               <w:rPr>
                 <w:rStyle w:val="Hyperlink"/>
@@ -463,7 +463,7 @@
                 <w:noProof/>
                 <w:webHidden/>
               </w:rPr>
-              <w:instrText xml:space="preserve"> PAGEREF _Toc230244797 \h </w:instrText>
+              <w:instrText xml:space="preserve"> PAGEREF _Toc230270300 \h </w:instrText>
             </w:r>
             <w:r>
               <w:rPr>
@@ -507,7 +507,7 @@
               <w:lang w:eastAsia="pt-BR"/>
             </w:rPr>
           </w:pPr>
-          <w:hyperlink w:anchor="_Toc230244798" w:history="1">
+          <w:hyperlink w:anchor="_Toc230270301" w:history="1">
             <w:r>
               <w:rPr>
                 <w:rStyle w:val="Hyperlink"/>
@@ -549,7 +549,7 @@
                 <w:noProof/>
                 <w:webHidden/>
               </w:rPr>
-              <w:instrText xml:space="preserve"> PAGEREF _Toc230244798 \h </w:instrText>
+              <w:instrText xml:space="preserve"> PAGEREF _Toc230270301 \h </w:instrText>
             </w:r>
             <w:r>
               <w:rPr>
@@ -592,7 +592,7 @@
               <w:lang w:eastAsia="pt-BR"/>
             </w:rPr>
           </w:pPr>
-          <w:hyperlink w:anchor="_Toc230244799" w:history="1">
+          <w:hyperlink w:anchor="_Toc230270302" w:history="1">
             <w:r>
               <w:rPr>
                 <w:rStyle w:val="Hyperlink"/>
@@ -619,7 +619,7 @@
                 <w:noProof/>
                 <w:webHidden/>
               </w:rPr>
-              <w:instrText xml:space="preserve"> PAGEREF _Toc230244799 \h </w:instrText>
+              <w:instrText xml:space="preserve"> PAGEREF _Toc230270302 \h </w:instrText>
             </w:r>
             <w:r>
               <w:rPr>
@@ -662,7 +662,7 @@
               <w:lang w:eastAsia="pt-BR"/>
             </w:rPr>
           </w:pPr>
-          <w:hyperlink w:anchor="_Toc230244800" w:history="1">
+          <w:hyperlink w:anchor="_Toc230270303" w:history="1">
             <w:r>
               <w:rPr>
                 <w:rStyle w:val="Hyperlink"/>
@@ -689,7 +689,7 @@
                 <w:noProof/>
                 <w:webHidden/>
               </w:rPr>
-              <w:instrText xml:space="preserve"> PAGEREF _Toc230244800 \h </w:instrText>
+              <w:instrText xml:space="preserve"> PAGEREF _Toc230270303 \h </w:instrText>
             </w:r>
             <w:r>
               <w:rPr>
@@ -733,7 +733,7 @@
               <w:lang w:eastAsia="pt-BR"/>
             </w:rPr>
           </w:pPr>
-          <w:hyperlink w:anchor="_Toc230244801" w:history="1">
+          <w:hyperlink w:anchor="_Toc230270304" w:history="1">
             <w:r>
               <w:rPr>
                 <w:rStyle w:val="Hyperlink"/>
@@ -775,7 +775,7 @@
                 <w:noProof/>
                 <w:webHidden/>
               </w:rPr>
-              <w:instrText xml:space="preserve"> PAGEREF _Toc230244801 \h </w:instrText>
+              <w:instrText xml:space="preserve"> PAGEREF _Toc230270304 \h </w:instrText>
             </w:r>
             <w:r>
               <w:rPr>
@@ -819,7 +819,7 @@
               <w:lang w:eastAsia="pt-BR"/>
             </w:rPr>
           </w:pPr>
-          <w:hyperlink w:anchor="_Toc230244802" w:history="1">
+          <w:hyperlink w:anchor="_Toc230270305" w:history="1">
             <w:r>
               <w:rPr>
                 <w:rStyle w:val="Hyperlink"/>
@@ -861,7 +861,7 @@
                 <w:noProof/>
                 <w:webHidden/>
               </w:rPr>
-              <w:instrText xml:space="preserve"> PAGEREF _Toc230244802 \h </w:instrText>
+              <w:instrText xml:space="preserve"> PAGEREF _Toc230270305 \h </w:instrText>
             </w:r>
             <w:r>
               <w:rPr>
@@ -904,7 +904,7 @@
               <w:lang w:eastAsia="pt-BR"/>
             </w:rPr>
           </w:pPr>
-          <w:hyperlink w:anchor="_Toc230244803" w:history="1">
+          <w:hyperlink w:anchor="_Toc230270306" w:history="1">
             <w:r>
               <w:rPr>
                 <w:rStyle w:val="Hyperlink"/>
@@ -931,7 +931,7 @@
                 <w:noProof/>
                 <w:webHidden/>
               </w:rPr>
-              <w:instrText xml:space="preserve"> PAGEREF _Toc230244803 \h </w:instrText>
+              <w:instrText xml:space="preserve"> PAGEREF _Toc230270306 \h </w:instrText>
             </w:r>
             <w:r>
               <w:rPr>
@@ -974,7 +974,7 @@
               <w:lang w:eastAsia="pt-BR"/>
             </w:rPr>
           </w:pPr>
-          <w:hyperlink w:anchor="_Toc230244804" w:history="1">
+          <w:hyperlink w:anchor="_Toc230270307" w:history="1">
             <w:r>
               <w:rPr>
                 <w:rStyle w:val="Hyperlink"/>
@@ -1001,7 +1001,7 @@
                 <w:noProof/>
                 <w:webHidden/>
               </w:rPr>
-              <w:instrText xml:space="preserve"> PAGEREF _Toc230244804 \h </w:instrText>
+              <w:instrText xml:space="preserve"> PAGEREF _Toc230270307 \h </w:instrText>
             </w:r>
             <w:r>
               <w:rPr>
@@ -1045,7 +1045,7 @@
               <w:lang w:eastAsia="pt-BR"/>
             </w:rPr>
           </w:pPr>
-          <w:hyperlink w:anchor="_Toc230244805" w:history="1">
+          <w:hyperlink w:anchor="_Toc230270308" w:history="1">
             <w:r>
               <w:rPr>
                 <w:rStyle w:val="Hyperlink"/>
@@ -1087,7 +1087,7 @@
                 <w:noProof/>
                 <w:webHidden/>
               </w:rPr>
-              <w:instrText xml:space="preserve"> PAGEREF _Toc230244805 \h </w:instrText>
+              <w:instrText xml:space="preserve"> PAGEREF _Toc230270308 \h </w:instrText>
             </w:r>
             <w:r>
               <w:rPr>
@@ -1130,7 +1130,7 @@
               <w:lang w:eastAsia="pt-BR"/>
             </w:rPr>
           </w:pPr>
-          <w:hyperlink w:anchor="_Toc230244806" w:history="1">
+          <w:hyperlink w:anchor="_Toc230270309" w:history="1">
             <w:r>
               <w:rPr>
                 <w:rStyle w:val="Hyperlink"/>
@@ -1157,7 +1157,7 @@
                 <w:noProof/>
                 <w:webHidden/>
               </w:rPr>
-              <w:instrText xml:space="preserve"> PAGEREF _Toc230244806 \h </w:instrText>
+              <w:instrText xml:space="preserve"> PAGEREF _Toc230270309 \h </w:instrText>
             </w:r>
             <w:r>
               <w:rPr>
@@ -1200,7 +1200,7 @@
               <w:lang w:eastAsia="pt-BR"/>
             </w:rPr>
           </w:pPr>
-          <w:hyperlink w:anchor="_Toc230244807" w:history="1">
+          <w:hyperlink w:anchor="_Toc230270310" w:history="1">
             <w:r>
               <w:rPr>
                 <w:rStyle w:val="Hyperlink"/>
@@ -1227,7 +1227,7 @@
                 <w:noProof/>
                 <w:webHidden/>
               </w:rPr>
-              <w:instrText xml:space="preserve"> PAGEREF _Toc230244807 \h </w:instrText>
+              <w:instrText xml:space="preserve"> PAGEREF _Toc230270310 \h </w:instrText>
             </w:r>
             <w:r>
               <w:rPr>
@@ -1270,7 +1270,7 @@
               <w:lang w:eastAsia="pt-BR"/>
             </w:rPr>
           </w:pPr>
-          <w:hyperlink w:anchor="_Toc230244808" w:history="1">
+          <w:hyperlink w:anchor="_Toc230270311" w:history="1">
             <w:r>
               <w:rPr>
                 <w:rStyle w:val="Hyperlink"/>
@@ -1297,7 +1297,7 @@
                 <w:noProof/>
                 <w:webHidden/>
               </w:rPr>
-              <w:instrText xml:space="preserve"> PAGEREF _Toc230244808 \h </w:instrText>
+              <w:instrText xml:space="preserve"> PAGEREF _Toc230270311 \h </w:instrText>
             </w:r>
             <w:r>
               <w:rPr>
@@ -1318,6 +1318,162 @@
                 <w:webHidden/>
               </w:rPr>
               <w:t>18</w:t>
+            </w:r>
+            <w:r>
+              <w:rPr>
+                <w:noProof/>
+                <w:webHidden/>
+              </w:rPr>
+              <w:fldChar w:fldCharType="end"/>
+            </w:r>
+          </w:hyperlink>
+        </w:p>
+        <w:p>
+          <w:pPr>
+            <w:pStyle w:val="Sumrio2"/>
+            <w:tabs>
+              <w:tab w:val="right" w:leader="dot" w:pos="8494"/>
+            </w:tabs>
+            <w:rPr>
+              <w:rFonts w:eastAsiaTheme="minorEastAsia"/>
+              <w:noProof/>
+              <w:lang w:eastAsia="pt-BR"/>
+            </w:rPr>
+          </w:pPr>
+          <w:hyperlink w:anchor="_Toc230270312" w:history="1">
+            <w:r>
+              <w:rPr>
+                <w:rStyle w:val="Hyperlink"/>
+                <w:noProof/>
+              </w:rPr>
+              <w:t>5.4 Scripts de Consulta</w:t>
+            </w:r>
+            <w:r>
+              <w:rPr>
+                <w:noProof/>
+                <w:webHidden/>
+              </w:rPr>
+              <w:tab/>
+            </w:r>
+            <w:r>
+              <w:rPr>
+                <w:noProof/>
+                <w:webHidden/>
+              </w:rPr>
+              <w:fldChar w:fldCharType="begin"/>
+            </w:r>
+            <w:r>
+              <w:rPr>
+                <w:noProof/>
+                <w:webHidden/>
+              </w:rPr>
+              <w:instrText xml:space="preserve"> PAGEREF _Toc230270312 \h </w:instrText>
+            </w:r>
+            <w:r>
+              <w:rPr>
+                <w:noProof/>
+                <w:webHidden/>
+              </w:rPr>
+            </w:r>
+            <w:r>
+              <w:rPr>
+                <w:noProof/>
+                <w:webHidden/>
+              </w:rPr>
+              <w:fldChar w:fldCharType="separate"/>
+            </w:r>
+            <w:r>
+              <w:rPr>
+                <w:noProof/>
+                <w:webHidden/>
+              </w:rPr>
+              <w:t>19</w:t>
+            </w:r>
+            <w:r>
+              <w:rPr>
+                <w:noProof/>
+                <w:webHidden/>
+              </w:rPr>
+              <w:fldChar w:fldCharType="end"/>
+            </w:r>
+          </w:hyperlink>
+        </w:p>
+        <w:p>
+          <w:pPr>
+            <w:pStyle w:val="Sumrio1"/>
+            <w:tabs>
+              <w:tab w:val="left" w:pos="480"/>
+              <w:tab w:val="right" w:leader="dot" w:pos="8494"/>
+            </w:tabs>
+            <w:rPr>
+              <w:rFonts w:eastAsiaTheme="minorEastAsia"/>
+              <w:noProof/>
+              <w:lang w:eastAsia="pt-BR"/>
+            </w:rPr>
+          </w:pPr>
+          <w:hyperlink w:anchor="_Toc230270313" w:history="1">
+            <w:r>
+              <w:rPr>
+                <w:rStyle w:val="Hyperlink"/>
+                <w:noProof/>
+              </w:rPr>
+              <w:t>6.</w:t>
+            </w:r>
+            <w:r>
+              <w:rPr>
+                <w:rFonts w:eastAsiaTheme="minorEastAsia"/>
+                <w:noProof/>
+                <w:lang w:eastAsia="pt-BR"/>
+              </w:rPr>
+              <w:tab/>
+            </w:r>
+            <w:r>
+              <w:rPr>
+                <w:rStyle w:val="Hyperlink"/>
+                <w:noProof/>
+              </w:rPr>
+              <w:t>CONCLUSÃO</w:t>
+            </w:r>
+            <w:r>
+              <w:rPr>
+                <w:noProof/>
+                <w:webHidden/>
+              </w:rPr>
+              <w:tab/>
+            </w:r>
+            <w:r>
+              <w:rPr>
+                <w:noProof/>
+                <w:webHidden/>
+              </w:rPr>
+              <w:fldChar w:fldCharType="begin"/>
+            </w:r>
+            <w:r>
+              <w:rPr>
+                <w:noProof/>
+                <w:webHidden/>
+              </w:rPr>
+              <w:instrText xml:space="preserve"> PAGEREF _Toc230270313 \h </w:instrText>
+            </w:r>
+            <w:r>
+              <w:rPr>
+                <w:noProof/>
+                <w:webHidden/>
+              </w:rPr>
+            </w:r>
+            <w:r>
+              <w:rPr>
+                <w:noProof/>
+                <w:webHidden/>
+              </w:rPr>
+              <w:fldChar w:fldCharType="separate"/>
+            </w:r>
+            <w:r>
+              <w:rPr>
+                <w:noProof/>
+                <w:webHidden/>
+              </w:rPr>
+              <w:t>23</w:t>
             </w:r>
             <w:r>
               <w:rPr>
@@ -1352,12 +1508,6 @@
     <w:p/>
     <w:p/>
     <w:p/>
-    <w:p/>
-    <w:p/>
-    <w:p/>
-    <w:p/>
-    <w:p/>
-    <w:p/>
     <w:p>
       <w:pPr>
         <w:pStyle w:val="Ttulo1"/>
@@ -1369,8 +1519,9 @@
         <w:jc w:val="both"/>
       </w:pPr>
       <w:bookmarkStart w:id="0" w:name="_Toc230030592"/>
-      <w:bookmarkStart w:id="1" w:name="_Toc230244797"/>
-      <w:r>
+      <w:bookmarkStart w:id="1" w:name="_Toc230270300"/>
+      <w:r>
+        <w:lastRenderedPageBreak/>
         <w:t>INTRODUÇÃO</w:t>
       </w:r>
       <w:bookmarkEnd w:id="0"/>
@@ -1467,8 +1618,9 @@
         <w:ind w:left="284"/>
         <w:jc w:val="both"/>
       </w:pPr>
-      <w:bookmarkStart w:id="2" w:name="_Toc230244798"/>
-      <w:r>
+      <w:bookmarkStart w:id="2" w:name="_Toc230270301"/>
+      <w:r>
+        <w:lastRenderedPageBreak/>
         <w:t>ESTUDO DE CASO</w:t>
       </w:r>
       <w:bookmarkEnd w:id="2"/>
@@ -1567,7 +1719,7 @@
         <w:pStyle w:val="Ttulo2"/>
         <w:jc w:val="both"/>
       </w:pPr>
-      <w:bookmarkStart w:id="3" w:name="_Toc230244799"/>
+      <w:bookmarkStart w:id="3" w:name="_Toc230270302"/>
       <w:r>
         <w:t>2</w:t>
       </w:r>
@@ -1755,7 +1907,7 @@
         <w:pStyle w:val="Ttulo2"/>
         <w:jc w:val="both"/>
       </w:pPr>
-      <w:bookmarkStart w:id="4" w:name="_Toc230244800"/>
+      <w:bookmarkStart w:id="4" w:name="_Toc230270303"/>
       <w:r>
         <w:t>2</w:t>
       </w:r>
@@ -1920,7 +2072,7 @@
         <w:ind w:left="284"/>
         <w:jc w:val="both"/>
       </w:pPr>
-      <w:bookmarkStart w:id="5" w:name="_Toc230244801"/>
+      <w:bookmarkStart w:id="5" w:name="_Toc230270304"/>
       <w:r>
         <w:lastRenderedPageBreak/>
         <w:t>ESQUEMA CONCEITUAL</w:t>
@@ -1995,7 +2147,7 @@
         <w:ind w:left="284"/>
         <w:jc w:val="both"/>
       </w:pPr>
-      <w:bookmarkStart w:id="6" w:name="_Toc230244802"/>
+      <w:bookmarkStart w:id="6" w:name="_Toc230270305"/>
       <w:r>
         <w:t>ESQUEMA LÓGICO</w:t>
       </w:r>
@@ -2222,7 +2374,7 @@
         <w:pStyle w:val="Ttulo2"/>
         <w:jc w:val="both"/>
       </w:pPr>
-      <w:bookmarkStart w:id="7" w:name="_Toc230244803"/>
+      <w:bookmarkStart w:id="7" w:name="_Toc230270306"/>
       <w:r>
         <w:lastRenderedPageBreak/>
         <w:t>4.</w:t>
@@ -14267,7 +14419,7 @@
         <w:pStyle w:val="Ttulo2"/>
         <w:jc w:val="both"/>
       </w:pPr>
-      <w:bookmarkStart w:id="8" w:name="_Toc230244804"/>
+      <w:bookmarkStart w:id="8" w:name="_Toc230270307"/>
       <w:r>
         <w:lastRenderedPageBreak/>
         <w:t>4.</w:t>
@@ -14936,7 +15088,7 @@
         <w:ind w:left="284"/>
         <w:jc w:val="both"/>
       </w:pPr>
-      <w:bookmarkStart w:id="9" w:name="_Toc230244805"/>
+      <w:bookmarkStart w:id="9" w:name="_Toc230270308"/>
       <w:r>
         <w:t>Scripts SQL</w:t>
       </w:r>
@@ -14947,7 +15099,7 @@
         <w:pStyle w:val="Ttulo2"/>
         <w:jc w:val="both"/>
       </w:pPr>
-      <w:bookmarkStart w:id="10" w:name="_Toc230244806"/>
+      <w:bookmarkStart w:id="10" w:name="_Toc230270309"/>
       <w:r>
         <w:t>5.1 Scripts de Criação</w:t>
       </w:r>
@@ -21134,7 +21286,7 @@
       <w:pPr>
         <w:pStyle w:val="Ttulo2"/>
       </w:pPr>
-      <w:bookmarkStart w:id="11" w:name="_Toc230244807"/>
+      <w:bookmarkStart w:id="11" w:name="_Toc230270310"/>
       <w:r>
         <w:t>5.2 Scripts de Povoamento</w:t>
       </w:r>
@@ -26730,7 +26882,7 @@
       <w:pPr>
         <w:pStyle w:val="Ttulo2"/>
       </w:pPr>
-      <w:bookmarkStart w:id="12" w:name="_Toc230244808"/>
+      <w:bookmarkStart w:id="12" w:name="_Toc230270311"/>
       <w:r>
         <w:t>5.3 Scripts de Operações</w:t>
       </w:r>
@@ -27766,9 +27918,11 @@
       <w:pPr>
         <w:pStyle w:val="Ttulo2"/>
       </w:pPr>
+      <w:bookmarkStart w:id="13" w:name="_Toc230270312"/>
       <w:r>
         <w:t>5.4 Scripts de Consulta</w:t>
       </w:r>
+      <w:bookmarkEnd w:id="13"/>
     </w:p>
     <w:p>
       <w:pPr>
@@ -34620,23 +34774,194 @@
     </w:p>
     <w:p>
       <w:pPr>
-        <w:spacing w:after="0"/>
-        <w:rPr>
-          <w:rFonts w:ascii="Consolas" w:hAnsi="Consolas"/>
-          <w:sz w:val="20"/>
-          <w:szCs w:val="20"/>
-        </w:rPr>
-      </w:pPr>
-    </w:p>
-    <w:p>
-      <w:pPr>
-        <w:spacing w:after="0"/>
-        <w:rPr>
-          <w:rFonts w:ascii="Consolas" w:hAnsi="Consolas"/>
-          <w:sz w:val="20"/>
-          <w:szCs w:val="20"/>
-        </w:rPr>
-      </w:pPr>
+        <w:pStyle w:val="Ttulo1"/>
+        <w:numPr>
+          <w:ilvl w:val="0"/>
+          <w:numId w:val="2"/>
+        </w:numPr>
+        <w:ind w:left="284"/>
+        <w:jc w:val="both"/>
+      </w:pPr>
+      <w:bookmarkStart w:id="14" w:name="_Toc230270313"/>
+      <w:r>
+        <w:t>CONCLUSÃO</w:t>
+      </w:r>
+      <w:bookmarkEnd w:id="14"/>
+    </w:p>
+    <w:p>
+      <w:pPr>
+        <w:jc w:val="both"/>
+        <w:rPr>
+          <w:rFonts w:ascii="Times New Roman" w:hAnsi="Times New Roman" w:cs="Times New Roman"/>
+        </w:rPr>
+      </w:pPr>
+      <w:r>
+        <w:rPr>
+          <w:rFonts w:ascii="Times New Roman" w:hAnsi="Times New Roman" w:cs="Times New Roman"/>
+        </w:rPr>
+        <w:t>Ao longo do desenvolvimento deste trabalho foi possível aplicar, na prática, os principais conceitos relacionados à modelagem e implementação de bancos de dados relacionais. O projeto “Sistema para Gestão de Pessoas Desempregadas” permitiu compreender melhor as etapas de análise de requisitos, criação do Modelo Entidade-Relacionamento, definição do modelo relacional e implementação do banco de dados utilizando SQL no PostgreSQL.</w:t>
+      </w:r>
+    </w:p>
+    <w:p>
+      <w:pPr>
+        <w:jc w:val="both"/>
+        <w:rPr>
+          <w:rFonts w:ascii="Times New Roman" w:hAnsi="Times New Roman" w:cs="Times New Roman"/>
+        </w:rPr>
+      </w:pPr>
+      <w:r>
+        <w:rPr>
+          <w:rFonts w:ascii="Times New Roman" w:hAnsi="Times New Roman" w:cs="Times New Roman"/>
+        </w:rPr>
+        <w:t xml:space="preserve">Durante o desenvolvimento foram utilizados conceitos importantes como entidades, atributos, relacionamentos, chaves primárias, chaves estrangeiras, tabelas associativas, integridade referencial e </w:t>
+      </w:r>
+      <w:proofErr w:type="spellStart"/>
+      <w:r>
+        <w:rPr>
+          <w:rFonts w:ascii="Times New Roman" w:hAnsi="Times New Roman" w:cs="Times New Roman"/>
+        </w:rPr>
+        <w:t>constraints</w:t>
+      </w:r>
+      <w:proofErr w:type="spellEnd"/>
+      <w:r>
+        <w:rPr>
+          <w:rFonts w:ascii="Times New Roman" w:hAnsi="Times New Roman" w:cs="Times New Roman"/>
+        </w:rPr>
+        <w:t xml:space="preserve">. Além disso, também foi possível desenvolver consultas SQL utilizando comandos como SELECT, WHERE, JOIN, GROUP BY, ORDER BY, COUNT, HAVING, UNION e </w:t>
+      </w:r>
+      <w:proofErr w:type="spellStart"/>
+      <w:r>
+        <w:rPr>
+          <w:rFonts w:ascii="Times New Roman" w:hAnsi="Times New Roman" w:cs="Times New Roman"/>
+        </w:rPr>
+        <w:t>subconsultas</w:t>
+      </w:r>
+      <w:proofErr w:type="spellEnd"/>
+      <w:r>
+        <w:rPr>
+          <w:rFonts w:ascii="Times New Roman" w:hAnsi="Times New Roman" w:cs="Times New Roman"/>
+        </w:rPr>
+        <w:t xml:space="preserve"> para emissão de relatórios e manipulação de dados.</w:t>
+      </w:r>
+    </w:p>
+    <w:p>
+      <w:pPr>
+        <w:jc w:val="both"/>
+        <w:rPr>
+          <w:rFonts w:ascii="Times New Roman" w:hAnsi="Times New Roman" w:cs="Times New Roman"/>
+        </w:rPr>
+      </w:pPr>
+      <w:r>
+        <w:rPr>
+          <w:rFonts w:ascii="Times New Roman" w:hAnsi="Times New Roman" w:cs="Times New Roman"/>
+        </w:rPr>
+        <w:t xml:space="preserve">Uma das principais dificuldades encontradas foi organizar corretamente os relacionamentos entre as tabelas e garantir que todas as </w:t>
+      </w:r>
+      <w:proofErr w:type="spellStart"/>
+      <w:r>
+        <w:rPr>
+          <w:rFonts w:ascii="Times New Roman" w:hAnsi="Times New Roman" w:cs="Times New Roman"/>
+        </w:rPr>
+        <w:t>foreign</w:t>
+      </w:r>
+      <w:proofErr w:type="spellEnd"/>
+      <w:r>
+        <w:rPr>
+          <w:rFonts w:ascii="Times New Roman" w:hAnsi="Times New Roman" w:cs="Times New Roman"/>
+        </w:rPr>
+        <w:t xml:space="preserve"> </w:t>
+      </w:r>
+      <w:proofErr w:type="spellStart"/>
+      <w:r>
+        <w:rPr>
+          <w:rFonts w:ascii="Times New Roman" w:hAnsi="Times New Roman" w:cs="Times New Roman"/>
+        </w:rPr>
+        <w:t>keys</w:t>
+      </w:r>
+      <w:proofErr w:type="spellEnd"/>
+      <w:r>
+        <w:rPr>
+          <w:rFonts w:ascii="Times New Roman" w:hAnsi="Times New Roman" w:cs="Times New Roman"/>
+        </w:rPr>
+        <w:t xml:space="preserve"> estivessem consistentes, principalmente nos processos de remoção de registros devido às restrições de integridade referencial. Também houve atenção especial na criação das </w:t>
+      </w:r>
+      <w:proofErr w:type="spellStart"/>
+      <w:r>
+        <w:rPr>
+          <w:rFonts w:ascii="Times New Roman" w:hAnsi="Times New Roman" w:cs="Times New Roman"/>
+        </w:rPr>
+        <w:t>constraints</w:t>
+      </w:r>
+      <w:proofErr w:type="spellEnd"/>
+      <w:r>
+        <w:rPr>
+          <w:rFonts w:ascii="Times New Roman" w:hAnsi="Times New Roman" w:cs="Times New Roman"/>
+        </w:rPr>
+        <w:t xml:space="preserve"> para evitar inconsistências nos dados cadastrados.</w:t>
+      </w:r>
+    </w:p>
+    <w:p>
+      <w:pPr>
+        <w:jc w:val="both"/>
+        <w:rPr>
+          <w:rFonts w:ascii="Times New Roman" w:hAnsi="Times New Roman" w:cs="Times New Roman"/>
+        </w:rPr>
+      </w:pPr>
+      <w:r>
+        <w:rPr>
+          <w:rFonts w:ascii="Times New Roman" w:hAnsi="Times New Roman" w:cs="Times New Roman"/>
+        </w:rPr>
+        <w:t>O trabalho contribuiu significativamente para o aprendizado sobre modelagem de banco de dados e estruturação de sistemas reais voltados à área social e de direitos humanos, permitindo compreender como um banco de dados pode auxiliar na organização de informações de pessoas desempregadas, vagas de emprego, cursos profissionalizantes e encaminhamentos.</w:t>
+      </w:r>
+    </w:p>
+    <w:p>
+      <w:pPr>
+        <w:jc w:val="both"/>
+        <w:rPr>
+          <w:rFonts w:ascii="Times New Roman" w:hAnsi="Times New Roman" w:cs="Times New Roman"/>
+        </w:rPr>
+      </w:pPr>
+      <w:r>
+        <w:rPr>
+          <w:rFonts w:ascii="Times New Roman" w:hAnsi="Times New Roman" w:cs="Times New Roman"/>
+        </w:rPr>
+        <w:t xml:space="preserve">Como melhoria futura para o projeto, seria possível implementar novas funcionalidades, como sistema de login para atendentes, histórico completo de candidaturas, acompanhamento de entrevistas, geração de relatórios mais avançados, integração com plataformas de emprego e criação de uma aplicação </w:t>
+      </w:r>
+      <w:proofErr w:type="gramStart"/>
+      <w:r>
+        <w:rPr>
+          <w:rFonts w:ascii="Times New Roman" w:hAnsi="Times New Roman" w:cs="Times New Roman"/>
+        </w:rPr>
+        <w:t>web ou desktop conectada</w:t>
+      </w:r>
+      <w:proofErr w:type="gramEnd"/>
+      <w:r>
+        <w:rPr>
+          <w:rFonts w:ascii="Times New Roman" w:hAnsi="Times New Roman" w:cs="Times New Roman"/>
+        </w:rPr>
+        <w:t xml:space="preserve"> ao banco </w:t>
+      </w:r>
+      <w:r>
+        <w:rPr>
+          <w:rFonts w:ascii="Times New Roman" w:hAnsi="Times New Roman" w:cs="Times New Roman"/>
+        </w:rPr>
+        <w:lastRenderedPageBreak/>
+        <w:t>de dados. Também poderiam ser adicionados mecanismos de segurança, auditoria e controle de permissões de usuários.</w:t>
+      </w:r>
+    </w:p>
+    <w:p>
+      <w:pPr>
+        <w:jc w:val="both"/>
+        <w:rPr>
+          <w:rFonts w:ascii="Times New Roman" w:hAnsi="Times New Roman" w:cs="Times New Roman"/>
+        </w:rPr>
+      </w:pPr>
+      <w:r>
+        <w:rPr>
+          <w:rFonts w:ascii="Times New Roman" w:hAnsi="Times New Roman" w:cs="Times New Roman"/>
+        </w:rPr>
+        <w:t>Dessa forma, conclui-se que o trabalho atingiu seus objetivos, proporcionando aprendizado técnico e prático sobre banco de dados relacionais, modelagem conceitual e desenvolvimento de scripts SQL aplicados a um cenário realista e socialmente relevante.</w:t>
+      </w:r>
     </w:p>
     <w:sectPr>
       <w:pgSz w:w="11906" w:h="16838"/>
@@ -35797,7 +36122,6 @@
   <w:style w:type="character" w:default="1" w:styleId="Fontepargpadro">
     <w:name w:val="Default Paragraph Font"/>
     <w:uiPriority w:val="1"/>
-    <w:semiHidden/>
     <w:unhideWhenUsed/>
   </w:style>
   <w:style w:type="table" w:default="1" w:styleId="Tabelanormal">

</xml_diff>

<commit_message>
foi corrigido e implementado informações obrigatórias no relatório e feito o desenvolvimento do diagrama relacional
</commit_message>
<xml_diff>
--- a/Relatório Técnico/Relatório Técnico Trabalho Banco de Dados.docx
+++ b/Relatório Técnico/Relatório Técnico Trabalho Banco de Dados.docx
@@ -421,7 +421,7 @@
           <w:r>
             <w:fldChar w:fldCharType="separate"/>
           </w:r>
-          <w:hyperlink w:anchor="_Toc230270300" w:history="1">
+          <w:hyperlink w:anchor="_Toc230685394" w:history="1">
             <w:r>
               <w:rPr>
                 <w:rStyle w:val="Hyperlink"/>
@@ -463,7 +463,7 @@
                 <w:noProof/>
                 <w:webHidden/>
               </w:rPr>
-              <w:instrText xml:space="preserve"> PAGEREF _Toc230270300 \h </w:instrText>
+              <w:instrText xml:space="preserve"> PAGEREF _Toc230685394 \h </w:instrText>
             </w:r>
             <w:r>
               <w:rPr>
@@ -507,7 +507,7 @@
               <w:lang w:eastAsia="pt-BR"/>
             </w:rPr>
           </w:pPr>
-          <w:hyperlink w:anchor="_Toc230270301" w:history="1">
+          <w:hyperlink w:anchor="_Toc230685395" w:history="1">
             <w:r>
               <w:rPr>
                 <w:rStyle w:val="Hyperlink"/>
@@ -549,7 +549,7 @@
                 <w:noProof/>
                 <w:webHidden/>
               </w:rPr>
-              <w:instrText xml:space="preserve"> PAGEREF _Toc230270301 \h </w:instrText>
+              <w:instrText xml:space="preserve"> PAGEREF _Toc230685395 \h </w:instrText>
             </w:r>
             <w:r>
               <w:rPr>
@@ -592,7 +592,7 @@
               <w:lang w:eastAsia="pt-BR"/>
             </w:rPr>
           </w:pPr>
-          <w:hyperlink w:anchor="_Toc230270302" w:history="1">
+          <w:hyperlink w:anchor="_Toc230685396" w:history="1">
             <w:r>
               <w:rPr>
                 <w:rStyle w:val="Hyperlink"/>
@@ -619,7 +619,7 @@
                 <w:noProof/>
                 <w:webHidden/>
               </w:rPr>
-              <w:instrText xml:space="preserve"> PAGEREF _Toc230270302 \h </w:instrText>
+              <w:instrText xml:space="preserve"> PAGEREF _Toc230685396 \h </w:instrText>
             </w:r>
             <w:r>
               <w:rPr>
@@ -662,7 +662,7 @@
               <w:lang w:eastAsia="pt-BR"/>
             </w:rPr>
           </w:pPr>
-          <w:hyperlink w:anchor="_Toc230270303" w:history="1">
+          <w:hyperlink w:anchor="_Toc230685397" w:history="1">
             <w:r>
               <w:rPr>
                 <w:rStyle w:val="Hyperlink"/>
@@ -689,7 +689,7 @@
                 <w:noProof/>
                 <w:webHidden/>
               </w:rPr>
-              <w:instrText xml:space="preserve"> PAGEREF _Toc230270303 \h </w:instrText>
+              <w:instrText xml:space="preserve"> PAGEREF _Toc230685397 \h </w:instrText>
             </w:r>
             <w:r>
               <w:rPr>
@@ -733,7 +733,7 @@
               <w:lang w:eastAsia="pt-BR"/>
             </w:rPr>
           </w:pPr>
-          <w:hyperlink w:anchor="_Toc230270304" w:history="1">
+          <w:hyperlink w:anchor="_Toc230685398" w:history="1">
             <w:r>
               <w:rPr>
                 <w:rStyle w:val="Hyperlink"/>
@@ -775,7 +775,7 @@
                 <w:noProof/>
                 <w:webHidden/>
               </w:rPr>
-              <w:instrText xml:space="preserve"> PAGEREF _Toc230270304 \h </w:instrText>
+              <w:instrText xml:space="preserve"> PAGEREF _Toc230685398 \h </w:instrText>
             </w:r>
             <w:r>
               <w:rPr>
@@ -819,7 +819,7 @@
               <w:lang w:eastAsia="pt-BR"/>
             </w:rPr>
           </w:pPr>
-          <w:hyperlink w:anchor="_Toc230270305" w:history="1">
+          <w:hyperlink w:anchor="_Toc230685399" w:history="1">
             <w:r>
               <w:rPr>
                 <w:rStyle w:val="Hyperlink"/>
@@ -861,7 +861,7 @@
                 <w:noProof/>
                 <w:webHidden/>
               </w:rPr>
-              <w:instrText xml:space="preserve"> PAGEREF _Toc230270305 \h </w:instrText>
+              <w:instrText xml:space="preserve"> PAGEREF _Toc230685399 \h </w:instrText>
             </w:r>
             <w:r>
               <w:rPr>
@@ -904,7 +904,7 @@
               <w:lang w:eastAsia="pt-BR"/>
             </w:rPr>
           </w:pPr>
-          <w:hyperlink w:anchor="_Toc230270306" w:history="1">
+          <w:hyperlink w:anchor="_Toc230685400" w:history="1">
             <w:r>
               <w:rPr>
                 <w:rStyle w:val="Hyperlink"/>
@@ -931,7 +931,7 @@
                 <w:noProof/>
                 <w:webHidden/>
               </w:rPr>
-              <w:instrText xml:space="preserve"> PAGEREF _Toc230270306 \h </w:instrText>
+              <w:instrText xml:space="preserve"> PAGEREF _Toc230685400 \h </w:instrText>
             </w:r>
             <w:r>
               <w:rPr>
@@ -974,7 +974,7 @@
               <w:lang w:eastAsia="pt-BR"/>
             </w:rPr>
           </w:pPr>
-          <w:hyperlink w:anchor="_Toc230270307" w:history="1">
+          <w:hyperlink w:anchor="_Toc230685401" w:history="1">
             <w:r>
               <w:rPr>
                 <w:rStyle w:val="Hyperlink"/>
@@ -1001,7 +1001,7 @@
                 <w:noProof/>
                 <w:webHidden/>
               </w:rPr>
-              <w:instrText xml:space="preserve"> PAGEREF _Toc230270307 \h </w:instrText>
+              <w:instrText xml:space="preserve"> PAGEREF _Toc230685401 \h </w:instrText>
             </w:r>
             <w:r>
               <w:rPr>
@@ -1021,7 +1021,7 @@
                 <w:noProof/>
                 <w:webHidden/>
               </w:rPr>
-              <w:t>11</w:t>
+              <w:t>12</w:t>
             </w:r>
             <w:r>
               <w:rPr>
@@ -1045,7 +1045,7 @@
               <w:lang w:eastAsia="pt-BR"/>
             </w:rPr>
           </w:pPr>
-          <w:hyperlink w:anchor="_Toc230270308" w:history="1">
+          <w:hyperlink w:anchor="_Toc230685402" w:history="1">
             <w:r>
               <w:rPr>
                 <w:rStyle w:val="Hyperlink"/>
@@ -1087,7 +1087,7 @@
                 <w:noProof/>
                 <w:webHidden/>
               </w:rPr>
-              <w:instrText xml:space="preserve"> PAGEREF _Toc230270308 \h </w:instrText>
+              <w:instrText xml:space="preserve"> PAGEREF _Toc230685402 \h </w:instrText>
             </w:r>
             <w:r>
               <w:rPr>
@@ -1107,7 +1107,7 @@
                 <w:noProof/>
                 <w:webHidden/>
               </w:rPr>
-              <w:t>11</w:t>
+              <w:t>12</w:t>
             </w:r>
             <w:r>
               <w:rPr>
@@ -1130,7 +1130,7 @@
               <w:lang w:eastAsia="pt-BR"/>
             </w:rPr>
           </w:pPr>
-          <w:hyperlink w:anchor="_Toc230270309" w:history="1">
+          <w:hyperlink w:anchor="_Toc230685403" w:history="1">
             <w:r>
               <w:rPr>
                 <w:rStyle w:val="Hyperlink"/>
@@ -1157,7 +1157,7 @@
                 <w:noProof/>
                 <w:webHidden/>
               </w:rPr>
-              <w:instrText xml:space="preserve"> PAGEREF _Toc230270309 \h </w:instrText>
+              <w:instrText xml:space="preserve"> PAGEREF _Toc230685403 \h </w:instrText>
             </w:r>
             <w:r>
               <w:rPr>
@@ -1177,7 +1177,7 @@
                 <w:noProof/>
                 <w:webHidden/>
               </w:rPr>
-              <w:t>11</w:t>
+              <w:t>12</w:t>
             </w:r>
             <w:r>
               <w:rPr>
@@ -1200,7 +1200,7 @@
               <w:lang w:eastAsia="pt-BR"/>
             </w:rPr>
           </w:pPr>
-          <w:hyperlink w:anchor="_Toc230270310" w:history="1">
+          <w:hyperlink w:anchor="_Toc230685404" w:history="1">
             <w:r>
               <w:rPr>
                 <w:rStyle w:val="Hyperlink"/>
@@ -1227,7 +1227,7 @@
                 <w:noProof/>
                 <w:webHidden/>
               </w:rPr>
-              <w:instrText xml:space="preserve"> PAGEREF _Toc230270310 \h </w:instrText>
+              <w:instrText xml:space="preserve"> PAGEREF _Toc230685404 \h </w:instrText>
             </w:r>
             <w:r>
               <w:rPr>
@@ -1247,7 +1247,7 @@
                 <w:noProof/>
                 <w:webHidden/>
               </w:rPr>
-              <w:t>15</w:t>
+              <w:t>16</w:t>
             </w:r>
             <w:r>
               <w:rPr>
@@ -1270,7 +1270,7 @@
               <w:lang w:eastAsia="pt-BR"/>
             </w:rPr>
           </w:pPr>
-          <w:hyperlink w:anchor="_Toc230270311" w:history="1">
+          <w:hyperlink w:anchor="_Toc230685405" w:history="1">
             <w:r>
               <w:rPr>
                 <w:rStyle w:val="Hyperlink"/>
@@ -1297,7 +1297,7 @@
                 <w:noProof/>
                 <w:webHidden/>
               </w:rPr>
-              <w:instrText xml:space="preserve"> PAGEREF _Toc230270311 \h </w:instrText>
+              <w:instrText xml:space="preserve"> PAGEREF _Toc230685405 \h </w:instrText>
             </w:r>
             <w:r>
               <w:rPr>
@@ -1317,7 +1317,7 @@
                 <w:noProof/>
                 <w:webHidden/>
               </w:rPr>
-              <w:t>18</w:t>
+              <w:t>19</w:t>
             </w:r>
             <w:r>
               <w:rPr>
@@ -1340,7 +1340,7 @@
               <w:lang w:eastAsia="pt-BR"/>
             </w:rPr>
           </w:pPr>
-          <w:hyperlink w:anchor="_Toc230270312" w:history="1">
+          <w:hyperlink w:anchor="_Toc230685406" w:history="1">
             <w:r>
               <w:rPr>
                 <w:rStyle w:val="Hyperlink"/>
@@ -1367,7 +1367,7 @@
                 <w:noProof/>
                 <w:webHidden/>
               </w:rPr>
-              <w:instrText xml:space="preserve"> PAGEREF _Toc230270312 \h </w:instrText>
+              <w:instrText xml:space="preserve"> PAGEREF _Toc230685406 \h </w:instrText>
             </w:r>
             <w:r>
               <w:rPr>
@@ -1387,7 +1387,7 @@
                 <w:noProof/>
                 <w:webHidden/>
               </w:rPr>
-              <w:t>19</w:t>
+              <w:t>20</w:t>
             </w:r>
             <w:r>
               <w:rPr>
@@ -1411,7 +1411,7 @@
               <w:lang w:eastAsia="pt-BR"/>
             </w:rPr>
           </w:pPr>
-          <w:hyperlink w:anchor="_Toc230270313" w:history="1">
+          <w:hyperlink w:anchor="_Toc230685407" w:history="1">
             <w:r>
               <w:rPr>
                 <w:rStyle w:val="Hyperlink"/>
@@ -1453,7 +1453,7 @@
                 <w:noProof/>
                 <w:webHidden/>
               </w:rPr>
-              <w:instrText xml:space="preserve"> PAGEREF _Toc230270313 \h </w:instrText>
+              <w:instrText xml:space="preserve"> PAGEREF _Toc230685407 \h </w:instrText>
             </w:r>
             <w:r>
               <w:rPr>
@@ -1473,7 +1473,77 @@
                 <w:noProof/>
                 <w:webHidden/>
               </w:rPr>
-              <w:t>23</w:t>
+              <w:t>24</w:t>
+            </w:r>
+            <w:r>
+              <w:rPr>
+                <w:noProof/>
+                <w:webHidden/>
+              </w:rPr>
+              <w:fldChar w:fldCharType="end"/>
+            </w:r>
+          </w:hyperlink>
+        </w:p>
+        <w:p>
+          <w:pPr>
+            <w:pStyle w:val="Sumrio1"/>
+            <w:tabs>
+              <w:tab w:val="right" w:leader="dot" w:pos="8494"/>
+            </w:tabs>
+            <w:rPr>
+              <w:rFonts w:eastAsiaTheme="minorEastAsia"/>
+              <w:noProof/>
+              <w:lang w:eastAsia="pt-BR"/>
+            </w:rPr>
+          </w:pPr>
+          <w:hyperlink w:anchor="_Toc230685408" w:history="1">
+            <w:r>
+              <w:rPr>
+                <w:rStyle w:val="Hyperlink"/>
+                <w:noProof/>
+              </w:rPr>
+              <w:t>REFERENCIAS</w:t>
+            </w:r>
+            <w:r>
+              <w:rPr>
+                <w:noProof/>
+                <w:webHidden/>
+              </w:rPr>
+              <w:tab/>
+            </w:r>
+            <w:r>
+              <w:rPr>
+                <w:noProof/>
+                <w:webHidden/>
+              </w:rPr>
+              <w:fldChar w:fldCharType="begin"/>
+            </w:r>
+            <w:r>
+              <w:rPr>
+                <w:noProof/>
+                <w:webHidden/>
+              </w:rPr>
+              <w:instrText xml:space="preserve"> PAGEREF _Toc230685408 \h </w:instrText>
+            </w:r>
+            <w:r>
+              <w:rPr>
+                <w:noProof/>
+                <w:webHidden/>
+              </w:rPr>
+            </w:r>
+            <w:r>
+              <w:rPr>
+                <w:noProof/>
+                <w:webHidden/>
+              </w:rPr>
+              <w:fldChar w:fldCharType="separate"/>
+            </w:r>
+            <w:r>
+              <w:rPr>
+                <w:noProof/>
+                <w:webHidden/>
+              </w:rPr>
+              <w:t>26</w:t>
             </w:r>
             <w:r>
               <w:rPr>
@@ -1519,7 +1589,7 @@
         <w:jc w:val="both"/>
       </w:pPr>
       <w:bookmarkStart w:id="0" w:name="_Toc230030592"/>
-      <w:bookmarkStart w:id="1" w:name="_Toc230270300"/>
+      <w:bookmarkStart w:id="1" w:name="_Toc230685394"/>
       <w:r>
         <w:lastRenderedPageBreak/>
         <w:t>INTRODUÇÃO</w:t>
@@ -1618,7 +1688,7 @@
         <w:ind w:left="284"/>
         <w:jc w:val="both"/>
       </w:pPr>
-      <w:bookmarkStart w:id="2" w:name="_Toc230270301"/>
+      <w:bookmarkStart w:id="2" w:name="_Toc230685395"/>
       <w:r>
         <w:lastRenderedPageBreak/>
         <w:t>ESTUDO DE CASO</w:t>
@@ -1719,7 +1789,7 @@
         <w:pStyle w:val="Ttulo2"/>
         <w:jc w:val="both"/>
       </w:pPr>
-      <w:bookmarkStart w:id="3" w:name="_Toc230270302"/>
+      <w:bookmarkStart w:id="3" w:name="_Toc230685396"/>
       <w:r>
         <w:t>2</w:t>
       </w:r>
@@ -1907,7 +1977,7 @@
         <w:pStyle w:val="Ttulo2"/>
         <w:jc w:val="both"/>
       </w:pPr>
-      <w:bookmarkStart w:id="4" w:name="_Toc230270303"/>
+      <w:bookmarkStart w:id="4" w:name="_Toc230685397"/>
       <w:r>
         <w:t>2</w:t>
       </w:r>
@@ -2072,7 +2142,7 @@
         <w:ind w:left="284"/>
         <w:jc w:val="both"/>
       </w:pPr>
-      <w:bookmarkStart w:id="5" w:name="_Toc230270304"/>
+      <w:bookmarkStart w:id="5" w:name="_Toc230685398"/>
       <w:r>
         <w:lastRenderedPageBreak/>
         <w:t>ESQUEMA CONCEITUAL</w:t>
@@ -2147,7 +2217,7 @@
         <w:ind w:left="284"/>
         <w:jc w:val="both"/>
       </w:pPr>
-      <w:bookmarkStart w:id="6" w:name="_Toc230270305"/>
+      <w:bookmarkStart w:id="6" w:name="_Toc230685399"/>
       <w:r>
         <w:t>ESQUEMA LÓGICO</w:t>
       </w:r>
@@ -2176,7 +2246,15 @@
       </w:r>
       <w:proofErr w:type="gramEnd"/>
       <w:r>
-        <w:t xml:space="preserve">, Nome, DataNascimento, Telefone, Escolaridade, </w:t>
+        <w:t xml:space="preserve">, Nome, </w:t>
+      </w:r>
+      <w:proofErr w:type="spellStart"/>
+      <w:r>
+        <w:t>DataNascimento</w:t>
+      </w:r>
+      <w:proofErr w:type="spellEnd"/>
+      <w:r>
+        <w:t xml:space="preserve">, Telefone, Escolaridade, </w:t>
       </w:r>
       <w:proofErr w:type="spellStart"/>
       <w:r>
@@ -2426,26 +2504,105 @@
         <w:t>PARTICIPACAO_CURSO</w:t>
       </w:r>
       <w:r>
-        <w:t xml:space="preserve"> ( </w:t>
+        <w:t xml:space="preserve"> </w:t>
+      </w:r>
+      <w:proofErr w:type="gramStart"/>
+      <w:r>
+        <w:t xml:space="preserve">( </w:t>
       </w:r>
       <w:r>
         <w:rPr>
           <w:u w:val="single"/>
         </w:rPr>
-        <w:t>#CPF, #CodigoCurso</w:t>
+        <w:t>#</w:t>
+      </w:r>
+      <w:proofErr w:type="gramEnd"/>
+      <w:r>
+        <w:rPr>
+          <w:u w:val="single"/>
+        </w:rPr>
+        <w:t>CPF, #</w:t>
+      </w:r>
+      <w:proofErr w:type="gramStart"/>
+      <w:r>
+        <w:rPr>
+          <w:u w:val="single"/>
+        </w:rPr>
+        <w:t>CodigoCurso</w:t>
       </w:r>
       <w:r>
         <w:t xml:space="preserve"> )</w:t>
       </w:r>
+      <w:proofErr w:type="gramEnd"/>
+    </w:p>
+    <w:p>
+      <w:pPr>
+        <w:jc w:val="both"/>
+      </w:pPr>
+      <w:r>
+        <w:lastRenderedPageBreak/>
+        <w:drawing>
+          <wp:inline distT="0" distB="0" distL="0" distR="0" wp14:anchorId="6CB28933" wp14:editId="118FFA17">
+            <wp:extent cx="5287618" cy="6609523"/>
+            <wp:effectExtent l="0" t="0" r="8890" b="1270"/>
+            <wp:docPr id="1884590105" name="Imagem 2"/>
+            <wp:cNvGraphicFramePr>
+              <a:graphicFrameLocks xmlns:a="http://schemas.openxmlformats.org/drawingml/2006/main" noChangeAspect="1"/>
+            </wp:cNvGraphicFramePr>
+            <a:graphic xmlns:a="http://schemas.openxmlformats.org/drawingml/2006/main">
+              <a:graphicData uri="http://schemas.openxmlformats.org/drawingml/2006/picture">
+                <pic:pic xmlns:pic="http://schemas.openxmlformats.org/drawingml/2006/picture">
+                  <pic:nvPicPr>
+                    <pic:cNvPr id="0" name="Picture 8"/>
+                    <pic:cNvPicPr>
+                      <a:picLocks noChangeAspect="1" noChangeArrowheads="1"/>
+                    </pic:cNvPicPr>
+                  </pic:nvPicPr>
+                  <pic:blipFill>
+                    <a:blip r:embed="rId10">
+                      <a:extLst>
+                        <a:ext uri="{28A0092B-C50C-407E-A947-70E740481C1C}">
+                          <a14:useLocalDpi xmlns:a14="http://schemas.microsoft.com/office/drawing/2010/main" val="0"/>
+                        </a:ext>
+                      </a:extLst>
+                    </a:blip>
+                    <a:srcRect/>
+                    <a:stretch>
+                      <a:fillRect/>
+                    </a:stretch>
+                  </pic:blipFill>
+                  <pic:spPr bwMode="auto">
+                    <a:xfrm>
+                      <a:off x="0" y="0"/>
+                      <a:ext cx="5293840" cy="6617300"/>
+                    </a:xfrm>
+                    <a:prstGeom prst="rect">
+                      <a:avLst/>
+                    </a:prstGeom>
+                    <a:noFill/>
+                    <a:ln>
+                      <a:noFill/>
+                    </a:ln>
+                  </pic:spPr>
+                </pic:pic>
+              </a:graphicData>
+            </a:graphic>
+          </wp:inline>
+        </w:drawing>
+      </w:r>
+    </w:p>
+    <w:p>
+      <w:pPr>
+        <w:jc w:val="both"/>
+      </w:pPr>
     </w:p>
     <w:p>
       <w:pPr>
         <w:pStyle w:val="Ttulo2"/>
         <w:jc w:val="both"/>
       </w:pPr>
-      <w:bookmarkStart w:id="7" w:name="_Toc230270306"/>
-      <w:r>
-        <w:lastRenderedPageBreak/>
+      <w:bookmarkStart w:id="7" w:name="_Toc230685400"/>
+      <w:r>
         <w:t>4.</w:t>
       </w:r>
       <w:r>
@@ -2895,6 +3052,7 @@
               <w:rPr>
                 <w:rFonts w:ascii="Times New Roman" w:hAnsi="Times New Roman" w:cs="Times New Roman"/>
               </w:rPr>
+              <w:lastRenderedPageBreak/>
               <w:t>nome</w:t>
             </w:r>
           </w:p>
@@ -4701,7 +4859,6 @@
         <w:rPr>
           <w:rFonts w:ascii="Times New Roman" w:hAnsi="Times New Roman" w:cs="Times New Roman"/>
         </w:rPr>
-        <w:lastRenderedPageBreak/>
         <w:t>TABELA EMPRESA</w:t>
       </w:r>
     </w:p>
@@ -4764,6 +4921,7 @@
                 <w:b/>
                 <w:bCs/>
               </w:rPr>
+              <w:lastRenderedPageBreak/>
               <w:t>Atributo</w:t>
             </w:r>
           </w:p>
@@ -6606,7 +6764,6 @@
         <w:rPr>
           <w:rFonts w:ascii="Times New Roman" w:hAnsi="Times New Roman" w:cs="Times New Roman"/>
         </w:rPr>
-        <w:lastRenderedPageBreak/>
         <w:t>TABELA VAGA</w:t>
       </w:r>
     </w:p>
@@ -6669,6 +6826,7 @@
                 <w:b/>
                 <w:bCs/>
               </w:rPr>
+              <w:lastRenderedPageBreak/>
               <w:t>Atributo</w:t>
             </w:r>
           </w:p>
@@ -9214,7 +9372,6 @@
         <w:rPr>
           <w:rFonts w:ascii="Times New Roman" w:hAnsi="Times New Roman" w:cs="Times New Roman"/>
         </w:rPr>
-        <w:lastRenderedPageBreak/>
         <w:t>TABELA INSTITUICAO</w:t>
       </w:r>
     </w:p>
@@ -9277,6 +9434,7 @@
                 <w:b/>
                 <w:bCs/>
               </w:rPr>
+              <w:lastRenderedPageBreak/>
               <w:t>Atributo</w:t>
             </w:r>
           </w:p>
@@ -12025,7 +12183,6 @@
         <w:rPr>
           <w:rFonts w:ascii="Times New Roman" w:hAnsi="Times New Roman" w:cs="Times New Roman"/>
         </w:rPr>
-        <w:lastRenderedPageBreak/>
         <w:t>TABELA ENCAMINHAMENTO</w:t>
       </w:r>
     </w:p>
@@ -12088,6 +12245,7 @@
                 <w:b/>
                 <w:bCs/>
               </w:rPr>
+              <w:lastRenderedPageBreak/>
               <w:t>Atributo</w:t>
             </w:r>
           </w:p>
@@ -14488,7 +14646,7 @@
         <w:pStyle w:val="Ttulo2"/>
         <w:jc w:val="both"/>
       </w:pPr>
-      <w:bookmarkStart w:id="8" w:name="_Toc230270307"/>
+      <w:bookmarkStart w:id="8" w:name="_Toc230685401"/>
       <w:r>
         <w:lastRenderedPageBreak/>
         <w:t>4.</w:t>
@@ -15157,7 +15315,7 @@
         <w:ind w:left="284"/>
         <w:jc w:val="both"/>
       </w:pPr>
-      <w:bookmarkStart w:id="9" w:name="_Toc230270308"/>
+      <w:bookmarkStart w:id="9" w:name="_Toc230685402"/>
       <w:r>
         <w:t>Scripts SQL</w:t>
       </w:r>
@@ -15168,7 +15326,7 @@
         <w:pStyle w:val="Ttulo2"/>
         <w:jc w:val="both"/>
       </w:pPr>
-      <w:bookmarkStart w:id="10" w:name="_Toc230270309"/>
+      <w:bookmarkStart w:id="10" w:name="_Toc230685403"/>
       <w:r>
         <w:t>5.1 Scripts de Criação</w:t>
       </w:r>
@@ -16168,15 +16326,7 @@
           <w:sz w:val="20"/>
           <w:szCs w:val="20"/>
         </w:rPr>
-        <w:t xml:space="preserve">    </w:t>
-      </w:r>
-      <w:r>
-        <w:rPr>
-          <w:rFonts w:ascii="Consolas" w:hAnsi="Consolas"/>
-          <w:sz w:val="20"/>
-          <w:szCs w:val="20"/>
-        </w:rPr>
-        <w:t xml:space="preserve">bairro </w:t>
+        <w:t xml:space="preserve">    bairro </w:t>
       </w:r>
       <w:proofErr w:type="gramStart"/>
       <w:r>
@@ -17038,15 +17188,7 @@
           <w:sz w:val="20"/>
           <w:szCs w:val="20"/>
         </w:rPr>
-        <w:t xml:space="preserve">    </w:t>
-      </w:r>
-      <w:r>
-        <w:rPr>
-          <w:rFonts w:ascii="Consolas" w:hAnsi="Consolas"/>
-          <w:sz w:val="20"/>
-          <w:szCs w:val="20"/>
-        </w:rPr>
-        <w:t xml:space="preserve">bairro </w:t>
+        <w:t xml:space="preserve">    bairro </w:t>
       </w:r>
       <w:proofErr w:type="gramStart"/>
       <w:r>
@@ -21825,7 +21967,7 @@
       <w:pPr>
         <w:pStyle w:val="Ttulo2"/>
       </w:pPr>
-      <w:bookmarkStart w:id="11" w:name="_Toc230270310"/>
+      <w:bookmarkStart w:id="11" w:name="_Toc230685404"/>
       <w:r>
         <w:t>5.2 Scripts de Povoamento</w:t>
       </w:r>
@@ -27421,7 +27563,7 @@
       <w:pPr>
         <w:pStyle w:val="Ttulo2"/>
       </w:pPr>
-      <w:bookmarkStart w:id="12" w:name="_Toc230270311"/>
+      <w:bookmarkStart w:id="12" w:name="_Toc230685405"/>
       <w:r>
         <w:t>5.3 Scripts de Operações</w:t>
       </w:r>
@@ -28457,7 +28599,7 @@
       <w:pPr>
         <w:pStyle w:val="Ttulo2"/>
       </w:pPr>
-      <w:bookmarkStart w:id="13" w:name="_Toc230270312"/>
+      <w:bookmarkStart w:id="13" w:name="_Toc230685406"/>
       <w:r>
         <w:t>5.4 Scripts de Consulta</w:t>
       </w:r>
@@ -35321,7 +35463,7 @@
         <w:ind w:left="284"/>
         <w:jc w:val="both"/>
       </w:pPr>
-      <w:bookmarkStart w:id="14" w:name="_Toc230270313"/>
+      <w:bookmarkStart w:id="14" w:name="_Toc230685407"/>
       <w:r>
         <w:t>CONCLUSÃO</w:t>
       </w:r>
@@ -35500,6 +35642,480 @@
           <w:rFonts w:ascii="Times New Roman" w:hAnsi="Times New Roman" w:cs="Times New Roman"/>
         </w:rPr>
         <w:t>Dessa forma, conclui-se que o trabalho atingiu seus objetivos, proporcionando aprendizado técnico e prático sobre banco de dados relacionais, modelagem conceitual e desenvolvimento de scripts SQL aplicados a um cenário realista e socialmente relevante.</w:t>
+      </w:r>
+    </w:p>
+    <w:p>
+      <w:pPr>
+        <w:jc w:val="both"/>
+        <w:rPr>
+          <w:rFonts w:ascii="Times New Roman" w:hAnsi="Times New Roman" w:cs="Times New Roman"/>
+        </w:rPr>
+      </w:pPr>
+    </w:p>
+    <w:p>
+      <w:pPr>
+        <w:jc w:val="both"/>
+        <w:rPr>
+          <w:rFonts w:ascii="Times New Roman" w:hAnsi="Times New Roman" w:cs="Times New Roman"/>
+        </w:rPr>
+      </w:pPr>
+    </w:p>
+    <w:p>
+      <w:pPr>
+        <w:jc w:val="both"/>
+        <w:rPr>
+          <w:rFonts w:ascii="Times New Roman" w:hAnsi="Times New Roman" w:cs="Times New Roman"/>
+        </w:rPr>
+      </w:pPr>
+    </w:p>
+    <w:p>
+      <w:pPr>
+        <w:jc w:val="both"/>
+        <w:rPr>
+          <w:rFonts w:ascii="Times New Roman" w:hAnsi="Times New Roman" w:cs="Times New Roman"/>
+        </w:rPr>
+      </w:pPr>
+    </w:p>
+    <w:p>
+      <w:pPr>
+        <w:jc w:val="both"/>
+        <w:rPr>
+          <w:rFonts w:ascii="Times New Roman" w:hAnsi="Times New Roman" w:cs="Times New Roman"/>
+        </w:rPr>
+      </w:pPr>
+    </w:p>
+    <w:p>
+      <w:pPr>
+        <w:jc w:val="both"/>
+        <w:rPr>
+          <w:rFonts w:ascii="Times New Roman" w:hAnsi="Times New Roman" w:cs="Times New Roman"/>
+        </w:rPr>
+      </w:pPr>
+    </w:p>
+    <w:p>
+      <w:pPr>
+        <w:jc w:val="both"/>
+        <w:rPr>
+          <w:rFonts w:ascii="Times New Roman" w:hAnsi="Times New Roman" w:cs="Times New Roman"/>
+        </w:rPr>
+      </w:pPr>
+    </w:p>
+    <w:p>
+      <w:pPr>
+        <w:jc w:val="both"/>
+        <w:rPr>
+          <w:rFonts w:ascii="Times New Roman" w:hAnsi="Times New Roman" w:cs="Times New Roman"/>
+        </w:rPr>
+      </w:pPr>
+    </w:p>
+    <w:p>
+      <w:pPr>
+        <w:jc w:val="both"/>
+        <w:rPr>
+          <w:rFonts w:ascii="Times New Roman" w:hAnsi="Times New Roman" w:cs="Times New Roman"/>
+        </w:rPr>
+      </w:pPr>
+    </w:p>
+    <w:p>
+      <w:pPr>
+        <w:jc w:val="both"/>
+        <w:rPr>
+          <w:rFonts w:ascii="Times New Roman" w:hAnsi="Times New Roman" w:cs="Times New Roman"/>
+        </w:rPr>
+      </w:pPr>
+    </w:p>
+    <w:p>
+      <w:pPr>
+        <w:jc w:val="both"/>
+        <w:rPr>
+          <w:rFonts w:ascii="Times New Roman" w:hAnsi="Times New Roman" w:cs="Times New Roman"/>
+        </w:rPr>
+      </w:pPr>
+    </w:p>
+    <w:p>
+      <w:pPr>
+        <w:jc w:val="both"/>
+        <w:rPr>
+          <w:rFonts w:ascii="Times New Roman" w:hAnsi="Times New Roman" w:cs="Times New Roman"/>
+        </w:rPr>
+      </w:pPr>
+    </w:p>
+    <w:p>
+      <w:pPr>
+        <w:jc w:val="both"/>
+        <w:rPr>
+          <w:rFonts w:ascii="Times New Roman" w:hAnsi="Times New Roman" w:cs="Times New Roman"/>
+        </w:rPr>
+      </w:pPr>
+    </w:p>
+    <w:p>
+      <w:pPr>
+        <w:jc w:val="both"/>
+        <w:rPr>
+          <w:rFonts w:ascii="Times New Roman" w:hAnsi="Times New Roman" w:cs="Times New Roman"/>
+        </w:rPr>
+      </w:pPr>
+    </w:p>
+    <w:p>
+      <w:pPr>
+        <w:jc w:val="both"/>
+        <w:rPr>
+          <w:rFonts w:ascii="Times New Roman" w:hAnsi="Times New Roman" w:cs="Times New Roman"/>
+        </w:rPr>
+      </w:pPr>
+    </w:p>
+    <w:p>
+      <w:pPr>
+        <w:jc w:val="both"/>
+        <w:rPr>
+          <w:rFonts w:ascii="Times New Roman" w:hAnsi="Times New Roman" w:cs="Times New Roman"/>
+        </w:rPr>
+      </w:pPr>
+    </w:p>
+    <w:p>
+      <w:pPr>
+        <w:jc w:val="both"/>
+        <w:rPr>
+          <w:rFonts w:ascii="Times New Roman" w:hAnsi="Times New Roman" w:cs="Times New Roman"/>
+        </w:rPr>
+      </w:pPr>
+    </w:p>
+    <w:p>
+      <w:pPr>
+        <w:jc w:val="both"/>
+        <w:rPr>
+          <w:rFonts w:ascii="Times New Roman" w:hAnsi="Times New Roman" w:cs="Times New Roman"/>
+        </w:rPr>
+      </w:pPr>
+    </w:p>
+    <w:p>
+      <w:pPr>
+        <w:jc w:val="both"/>
+        <w:rPr>
+          <w:rFonts w:ascii="Times New Roman" w:hAnsi="Times New Roman" w:cs="Times New Roman"/>
+        </w:rPr>
+      </w:pPr>
+    </w:p>
+    <w:p>
+      <w:pPr>
+        <w:jc w:val="both"/>
+        <w:rPr>
+          <w:rFonts w:ascii="Times New Roman" w:hAnsi="Times New Roman" w:cs="Times New Roman"/>
+        </w:rPr>
+      </w:pPr>
+    </w:p>
+    <w:p>
+      <w:pPr>
+        <w:jc w:val="both"/>
+        <w:rPr>
+          <w:rFonts w:ascii="Times New Roman" w:hAnsi="Times New Roman" w:cs="Times New Roman"/>
+        </w:rPr>
+      </w:pPr>
+    </w:p>
+    <w:p>
+      <w:pPr>
+        <w:pStyle w:val="Ttulo1"/>
+      </w:pPr>
+      <w:bookmarkStart w:id="15" w:name="_Toc230685408"/>
+      <w:r>
+        <w:lastRenderedPageBreak/>
+        <w:t>REFERENCIAS</w:t>
+      </w:r>
+      <w:bookmarkEnd w:id="15"/>
+    </w:p>
+    <w:p>
+      <w:pPr>
+        <w:spacing w:after="0"/>
+        <w:rPr>
+          <w:b/>
+          <w:bCs/>
+          <w:sz w:val="28"/>
+          <w:szCs w:val="28"/>
+        </w:rPr>
+      </w:pPr>
+      <w:r>
+        <w:rPr>
+          <w:b/>
+          <w:bCs/>
+          <w:sz w:val="28"/>
+          <w:szCs w:val="28"/>
+        </w:rPr>
+        <w:t xml:space="preserve">PostgreSQL </w:t>
+      </w:r>
+      <w:proofErr w:type="spellStart"/>
+      <w:r>
+        <w:rPr>
+          <w:b/>
+          <w:bCs/>
+          <w:sz w:val="28"/>
+          <w:szCs w:val="28"/>
+        </w:rPr>
+        <w:t>Documentation</w:t>
+      </w:r>
+      <w:proofErr w:type="spellEnd"/>
+    </w:p>
+    <w:p>
+      <w:pPr>
+        <w:spacing w:after="0"/>
+      </w:pPr>
+      <w:r>
+        <w:t xml:space="preserve">POSTGRESQL GLOBAL DEVELOPMENT GROUP. PostgreSQL </w:t>
+      </w:r>
+      <w:proofErr w:type="spellStart"/>
+      <w:r>
+        <w:t>Documentation</w:t>
+      </w:r>
+      <w:proofErr w:type="spellEnd"/>
+      <w:r>
+        <w:t xml:space="preserve">. Disponível em: https://www.postgresql.org/docs/. Acesso em: </w:t>
+      </w:r>
+      <w:r>
+        <w:t>15</w:t>
+      </w:r>
+      <w:r>
+        <w:t xml:space="preserve"> maio 2026.</w:t>
+      </w:r>
+    </w:p>
+    <w:p>
+      <w:pPr>
+        <w:spacing w:after="0"/>
+      </w:pPr>
+    </w:p>
+    <w:p>
+      <w:pPr>
+        <w:spacing w:after="0"/>
+        <w:rPr>
+          <w:b/>
+          <w:bCs/>
+          <w:sz w:val="28"/>
+          <w:szCs w:val="28"/>
+        </w:rPr>
+      </w:pPr>
+      <w:r>
+        <w:rPr>
+          <w:b/>
+          <w:bCs/>
+          <w:sz w:val="28"/>
+          <w:szCs w:val="28"/>
+        </w:rPr>
+        <w:t>D</w:t>
+      </w:r>
+      <w:r>
+        <w:rPr>
+          <w:b/>
+          <w:bCs/>
+          <w:sz w:val="28"/>
+          <w:szCs w:val="28"/>
+        </w:rPr>
+        <w:t>iagrams.net (</w:t>
+      </w:r>
+      <w:r>
+        <w:rPr>
+          <w:b/>
+          <w:bCs/>
+          <w:sz w:val="28"/>
+          <w:szCs w:val="28"/>
+        </w:rPr>
+        <w:t>D</w:t>
+      </w:r>
+      <w:r>
+        <w:rPr>
+          <w:b/>
+          <w:bCs/>
+          <w:sz w:val="28"/>
+          <w:szCs w:val="28"/>
+        </w:rPr>
+        <w:t>raw.io)</w:t>
+      </w:r>
+    </w:p>
+    <w:p>
+      <w:pPr>
+        <w:spacing w:after="0"/>
+      </w:pPr>
+      <w:r>
+        <w:t>JGRAPH LTD. diagrams.net.</w:t>
+      </w:r>
+      <w:r>
+        <w:t xml:space="preserve"> </w:t>
+      </w:r>
+    </w:p>
+    <w:p>
+      <w:pPr>
+        <w:spacing w:after="0"/>
+      </w:pPr>
+      <w:r>
+        <w:t xml:space="preserve">Disponível em: https://app.diagrams.net/. Acesso em: </w:t>
+      </w:r>
+      <w:r>
+        <w:t>17</w:t>
+      </w:r>
+      <w:r>
+        <w:t xml:space="preserve"> maio 2026.</w:t>
+      </w:r>
+    </w:p>
+    <w:p>
+      <w:pPr>
+        <w:spacing w:after="0"/>
+      </w:pPr>
+    </w:p>
+    <w:p>
+      <w:pPr>
+        <w:spacing w:after="0"/>
+        <w:rPr>
+          <w:b/>
+          <w:bCs/>
+          <w:sz w:val="28"/>
+          <w:szCs w:val="28"/>
+        </w:rPr>
+      </w:pPr>
+      <w:r>
+        <w:rPr>
+          <w:b/>
+          <w:bCs/>
+          <w:sz w:val="28"/>
+          <w:szCs w:val="28"/>
+        </w:rPr>
+        <w:t>ChatGPT - OpenAI</w:t>
+      </w:r>
+    </w:p>
+    <w:p>
+      <w:pPr>
+        <w:spacing w:after="0"/>
+      </w:pPr>
+      <w:r>
+        <w:t xml:space="preserve">OpenAI. ChatGPT. Utilizado como ferramenta de apoio para consultas SQL, modelagem relacional, geração de scripts de povoamento e auxílio na estruturação do relatório técnico. </w:t>
+      </w:r>
+    </w:p>
+    <w:p>
+      <w:pPr>
+        <w:spacing w:after="0"/>
+      </w:pPr>
+      <w:r>
+        <w:t xml:space="preserve">Disponível em: https://chat.openai.com/. Acesso em: </w:t>
+      </w:r>
+      <w:r>
+        <w:t>18</w:t>
+      </w:r>
+      <w:r>
+        <w:t xml:space="preserve"> maio 2026.</w:t>
+      </w:r>
+    </w:p>
+    <w:p>
+      <w:pPr>
+        <w:spacing w:after="0"/>
+      </w:pPr>
+    </w:p>
+    <w:p>
+      <w:pPr>
+        <w:spacing w:after="0"/>
+        <w:rPr>
+          <w:b/>
+          <w:bCs/>
+          <w:sz w:val="28"/>
+          <w:szCs w:val="28"/>
+        </w:rPr>
+      </w:pPr>
+      <w:r>
+        <w:rPr>
+          <w:b/>
+          <w:bCs/>
+          <w:sz w:val="28"/>
+          <w:szCs w:val="28"/>
+        </w:rPr>
+        <w:t>Curso de Banco de Dados SQL e Modelagem de Dados - YouTube</w:t>
+      </w:r>
+    </w:p>
+    <w:p>
+      <w:pPr>
+        <w:spacing w:after="0"/>
+      </w:pPr>
+      <w:r>
+        <w:t xml:space="preserve">FREECODECAMP. SQL Tutorial - Full </w:t>
+      </w:r>
+      <w:proofErr w:type="spellStart"/>
+      <w:r>
+        <w:t>Database</w:t>
+      </w:r>
+      <w:proofErr w:type="spellEnd"/>
+      <w:r>
+        <w:t xml:space="preserve"> </w:t>
+      </w:r>
+      <w:proofErr w:type="spellStart"/>
+      <w:r>
+        <w:t>Course</w:t>
+      </w:r>
+      <w:proofErr w:type="spellEnd"/>
+      <w:r>
+        <w:t xml:space="preserve"> for </w:t>
+      </w:r>
+      <w:proofErr w:type="spellStart"/>
+      <w:r>
+        <w:t>Beginners</w:t>
+      </w:r>
+      <w:proofErr w:type="spellEnd"/>
+      <w:r>
+        <w:t xml:space="preserve">. YouTube, 2018. </w:t>
+      </w:r>
+    </w:p>
+    <w:p>
+      <w:pPr>
+        <w:spacing w:after="0"/>
+      </w:pPr>
+      <w:r>
+        <w:t>Disponível em: https://www.youtube.com/watch?v=HXV3zeQKqGY. Acesso em: 2</w:t>
+      </w:r>
+      <w:r>
+        <w:t>3</w:t>
+      </w:r>
+      <w:r>
+        <w:t xml:space="preserve"> maio 2026.</w:t>
+      </w:r>
+    </w:p>
+    <w:p>
+      <w:pPr>
+        <w:spacing w:after="0"/>
+      </w:pPr>
+    </w:p>
+    <w:p>
+      <w:pPr>
+        <w:spacing w:after="0"/>
+        <w:rPr>
+          <w:b/>
+          <w:bCs/>
+          <w:sz w:val="28"/>
+          <w:szCs w:val="28"/>
+        </w:rPr>
+      </w:pPr>
+      <w:r>
+        <w:rPr>
+          <w:b/>
+          <w:bCs/>
+          <w:sz w:val="28"/>
+          <w:szCs w:val="28"/>
+        </w:rPr>
+        <w:t>W3Schools SQL Tutorial</w:t>
+      </w:r>
+    </w:p>
+    <w:p>
+      <w:pPr>
+        <w:spacing w:after="0"/>
+      </w:pPr>
+      <w:r>
+        <w:t xml:space="preserve">W3SCHOOLS. SQL Tutorial. </w:t>
+      </w:r>
+    </w:p>
+    <w:p>
+      <w:pPr>
+        <w:spacing w:after="0"/>
+      </w:pPr>
+      <w:r>
+        <w:t>Disponível em: https://www.w3schools.com/sql/. Acesso em: 2</w:t>
+      </w:r>
+      <w:r>
+        <w:t>3</w:t>
+      </w:r>
+      <w:r>
+        <w:t xml:space="preserve"> maio 2026.</w:t>
       </w:r>
     </w:p>
     <w:sectPr>
@@ -36661,7 +37277,6 @@
   <w:style w:type="character" w:default="1" w:styleId="Fontepargpadro">
     <w:name w:val="Default Paragraph Font"/>
     <w:uiPriority w:val="1"/>
-    <w:semiHidden/>
     <w:unhideWhenUsed/>
   </w:style>
   <w:style w:type="table" w:default="1" w:styleId="Tabelanormal">

</xml_diff>